<commit_message>
Support concise application emails and simplify the Yeb letter
Add an explicit email channel with bounded length and preserve attachment validation. Apply the revised employer voice to Yeb and record DOCX review. Validation: 597 tests passed (17 skipped), application lint and validation, one-page rendered review, catalog unchanged, prohibited API scan clean.
</commit_message>
<xml_diff>
--- a/registry/jobs/20261006_yeb_79ae138400d84b8fb939585de2aa77f1/application/cover-letter.docx
+++ b/registry/jobs/20261006_yeb_79ae138400d84b8fb939585de2aa77f1/application/cover-letter.docx
@@ -53,7 +53,7 @@
           <w:szCs w:val="24"/>
           <w:rtl w:val="false"/>
         </w:rPr>
-        <w:t xml:space="preserve">nei progetti e-commerce di Yeb posso contribuire alla parte PHP e alle integrazioni, dall'analisi della richiesta al rilascio. Vi scrivo per la posizione di Programmatore Senior PHP / Web developer.</w:t>
+        <w:t xml:space="preserve">vi scrivo per la posizione di Programmatore Senior PHP / Web developer. Il mio lavoro si concentra sul backend PHP e sulle integrazioni tra applicazioni e servizi.</w:t>
       </w:r>
     </w:p>
     <w:p>
@@ -70,7 +70,7 @@
           <w:szCs w:val="24"/>
           <w:rtl w:val="false"/>
         </w:rPr>
-        <w:t xml:space="preserve">Per un'applicazione commerciale, collegare servizi significa anche gestire correttamente identità e dati. In una recente integrazione in produzione ho curato autenticazione, collegamento degli account e trasferimento delle collezioni, con verifica della proprietà degli acquisti. È un'esperienza pertinente al vostro lavoro di personalizzazione e integrazione delle piattaforme e-commerce.</w:t>
+        <w:t xml:space="preserve">Ho lavorato su integrazioni commerciali in produzione, comprese autenticazione e gestione degli account. Accanto allo sviluppo, ho seguito la valutazione delle richieste, la suddivisione delle attività e il lavoro del team fino al rilascio. Sono aspetti su cui posso contribuire ai vostri progetti e‑commerce.</w:t>
       </w:r>
     </w:p>
     <w:p>
@@ -87,7 +87,7 @@
           <w:szCs w:val="24"/>
           <w:rtl w:val="false"/>
         </w:rPr>
-        <w:t xml:space="preserve">Alla parte di sviluppo affianco l'organizzazione del lavoro del team. Ho valutato e suddiviso attività backend, partecipato alla pianificazione con prodotto e sviluppo e seguito gli incarichi fino al rilascio. Posso quindi contribuire anche al confronto sulla fattibilità delle richieste e all'organizzazione delle attività, oltre che all'implementazione.</w:t>
+        <w:t xml:space="preserve">Posso iniziare entro una settimana. Vorrei sapere se per questa posizione è possibile lavorare da remoto o in modalità ibrida. Allego il mio CV e resto disponibile per un colloquio.</w:t>
       </w:r>
     </w:p>
     <w:p>
@@ -104,58 +104,8 @@
           <w:szCs w:val="24"/>
           <w:rtl w:val="false"/>
         </w:rPr>
-        <w:t xml:space="preserve">Mi interessa che nei vostri servizi lo sviluppo sia accompagnato da integrazioni, assistenza e manutenzione. È un contesto in cui la mia esperienza può essere utile anche dopo il primo rilascio. Il mio percorso è principalmente backend e API, mentre l'esperienza specifica sulle vostre piattaforme va approfondita insieme.</w:t>
-      </w:r>
-    </w:p>
-    <w:p>
-      <w:pPr>
-        <w:bidi w:val="false"/>
-        <w:spacing w:after="120" w:before="120" w:line="259.20000000000005"/>
-        <w:jc w:val="left"/>
-      </w:pPr>
-      <w:r>
-        <w:rPr>
-          <w:rFonts w:ascii="Aptos" w:cs="Aptos" w:eastAsia="Aptos" w:hAnsi="Aptos"/>
-          <w:color w:val="000000"/>
-          <w:sz w:val="24"/>
-          <w:szCs w:val="24"/>
-          <w:rtl w:val="false"/>
-        </w:rPr>
-        <w:t xml:space="preserve">Posso iniziare entro una settimana. Vorrei inoltre sapere se per questa posizione è possibile lavorare da remoto o in modalità ibrida. Allego il mio CV e resto disponibile per un colloquio e per discutere il contributo che potrei portare ai vostri progetti.</w:t>
-      </w:r>
-    </w:p>
-    <w:p>
-      <w:pPr>
-        <w:bidi w:val="false"/>
-        <w:spacing w:after="120" w:before="120" w:line="259.20000000000005"/>
-        <w:jc w:val="left"/>
-      </w:pPr>
-      <w:r>
-        <w:rPr>
-          <w:rFonts w:ascii="Aptos" w:cs="Aptos" w:eastAsia="Aptos" w:hAnsi="Aptos"/>
-          <w:color w:val="000000"/>
-          <w:sz w:val="24"/>
-          <w:szCs w:val="24"/>
-          <w:rtl w:val="false"/>
-        </w:rPr>
-        <w:t xml:space="preserve">Cordiali saluti,</w:t>
-      </w:r>
-    </w:p>
-    <w:p>
-      <w:pPr>
-        <w:bidi w:val="false"/>
-        <w:spacing w:after="120" w:before="120" w:line="259.20000000000005"/>
-        <w:jc w:val="left"/>
-      </w:pPr>
-      <w:r>
-        <w:rPr>
-          <w:rFonts w:ascii="Aptos" w:cs="Aptos" w:eastAsia="Aptos" w:hAnsi="Aptos"/>
-          <w:color w:val="000000"/>
-          <w:sz w:val="24"/>
-          <w:szCs w:val="24"/>
-          <w:rtl w:val="false"/>
-        </w:rPr>
-        <w:t xml:space="preserve">Valentin Nikolaev</w:t>
+        <w:t xml:space="preserve">Cordiali saluti,
+Valentin Nikolaev</w:t>
       </w:r>
     </w:p>
     <w:sectPr>

</xml_diff>